<commit_message>
Basically complete the voice based chatbot
</commit_message>
<xml_diff>
--- a/chatbot/Notes.docx
+++ b/chatbot/Notes.docx
@@ -3,11 +3,6 @@
 <w:document xmlns:wpc="http://schemas.microsoft.com/office/word/2010/wordprocessingCanvas" xmlns:cx="http://schemas.microsoft.com/office/drawing/2014/chartex" xmlns:cx1="http://schemas.microsoft.com/office/drawing/2015/9/8/chartex" xmlns:cx2="http://schemas.microsoft.com/office/drawing/2015/10/21/chartex" xmlns:cx3="http://schemas.microsoft.com/office/drawing/2016/5/9/chartex" xmlns:cx4="http://schemas.microsoft.com/office/drawing/2016/5/10/chartex" xmlns:cx5="http://schemas.microsoft.com/office/drawing/2016/5/11/chartex" xmlns:cx6="http://schemas.microsoft.com/office/drawing/2016/5/12/chartex" xmlns:cx7="http://schemas.microsoft.com/office/drawing/2016/5/13/chartex" xmlns:cx8="http://schemas.microsoft.com/office/drawing/2016/5/14/chartex" xmlns:mc="http://schemas.openxmlformats.org/markup-compatibility/2006" xmlns:aink="http://schemas.microsoft.com/office/drawing/2016/ink" xmlns:am3d="http://schemas.microsoft.com/office/drawing/2017/model3d" xmlns:o="urn:schemas-microsoft-com:office:office" xmlns:oel="http://schemas.microsoft.com/office/2019/extlst" xmlns:r="http://schemas.openxmlformats.org/officeDocument/2006/relationships" xmlns:m="http://schemas.openxmlformats.org/officeDocument/2006/math" xmlns:v="urn:schemas-microsoft-com:vml" xmlns:wp14="http://schemas.microsoft.com/office/word/2010/wordprocessingDrawing" xmlns:wp="http://schemas.openxmlformats.org/drawingml/2006/wordprocessingDrawing" xmlns:w10="urn:schemas-microsoft-com:office:word" xmlns:w="http://schemas.openxmlformats.org/wordprocessingml/2006/main" xmlns:w14="http://schemas.microsoft.com/office/word/2010/wordml" xmlns:w15="http://schemas.microsoft.com/office/word/2012/wordml" xmlns:w16cex="http://schemas.microsoft.com/office/word/2018/wordml/cex" xmlns:w16cid="http://schemas.microsoft.com/office/word/2016/wordml/cid" xmlns:w16="http://schemas.microsoft.com/office/word/2018/wordml" xmlns:w16du="http://schemas.microsoft.com/office/word/2023/wordml/word16du" xmlns:w16sdtdh="http://schemas.microsoft.com/office/word/2020/wordml/sdtdatahash" xmlns:w16sdtfl="http://schemas.microsoft.com/office/word/2024/wordml/sdtformatlock" xmlns:w16se="http://schemas.microsoft.com/office/word/2015/wordml/symex" xmlns:wpg="http://schemas.microsoft.com/office/word/2010/wordprocessingGroup" xmlns:wpi="http://schemas.microsoft.com/office/word/2010/wordprocessingInk" xmlns:wne="http://schemas.microsoft.com/office/word/2006/wordml" xmlns:wps="http://schemas.microsoft.com/office/word/2010/wordprocessingShape" mc:Ignorable="w14 w15 w16se w16cid w16 w16cex w16sdtdh w16sdtfl w16du wp14">
   <w:body>
     <w:p>
-      <w:pPr>
-        <w:rPr>
-          <w:rFonts w:hint="eastAsia"/>
-        </w:rPr>
-      </w:pPr>
       <w:r>
         <w:rPr>
           <w:rFonts w:hint="eastAsia"/>
@@ -27,11 +22,6 @@
     </w:p>
     <w:p/>
     <w:p>
-      <w:pPr>
-        <w:rPr>
-          <w:rFonts w:hint="eastAsia"/>
-        </w:rPr>
-      </w:pPr>
       <w:r>
         <w:t>Initially, I integrated the pyttsx3 library due to its simplicity and support for offline synthesis. However, I soon encountered several issues. The voice output quality and availability were heavily dependent on the host operating system, particularly on Windows, where voices like “Zira” or “David” are system-installed and may not exist on other devices. Moreover, macOS and Linux handle system voices differently, leading to inconsistent behavior across platforms and limited control over voice characteristics such as timbre, language, and emotional tone.</w:t>
       </w:r>
@@ -86,23 +76,89 @@
         <w:rPr>
           <w:rFonts w:hint="eastAsia"/>
         </w:rPr>
-        <w:t>Problems: the response of the chatgpt is not like a human,and the response is not finished.</w:t>
-      </w:r>
-    </w:p>
-    <w:p>
-      <w:r>
-        <w:rPr>
-          <w:rFonts w:hint="eastAsia"/>
-        </w:rPr>
-        <w:t xml:space="preserve">Aim: find a better tts tool,maybe help? </w:t>
-      </w:r>
-    </w:p>
-    <w:p>
-      <w:pPr>
-        <w:rPr>
-          <w:rFonts w:hint="eastAsia"/>
-        </w:rPr>
-      </w:pPr>
+        <w:t xml:space="preserve">Problems: the response of the </w:t>
+      </w:r>
+      <w:proofErr w:type="spellStart"/>
+      <w:r>
+        <w:rPr>
+          <w:rFonts w:hint="eastAsia"/>
+        </w:rPr>
+        <w:t>chatgpt</w:t>
+      </w:r>
+      <w:proofErr w:type="spellEnd"/>
+      <w:r>
+        <w:rPr>
+          <w:rFonts w:hint="eastAsia"/>
+        </w:rPr>
+        <w:t xml:space="preserve"> is not like a </w:t>
+      </w:r>
+      <w:proofErr w:type="spellStart"/>
+      <w:proofErr w:type="gramStart"/>
+      <w:r>
+        <w:rPr>
+          <w:rFonts w:hint="eastAsia"/>
+        </w:rPr>
+        <w:t>human,and</w:t>
+      </w:r>
+      <w:proofErr w:type="spellEnd"/>
+      <w:proofErr w:type="gramEnd"/>
+      <w:r>
+        <w:rPr>
+          <w:rFonts w:hint="eastAsia"/>
+        </w:rPr>
+        <w:t xml:space="preserve"> the response is not finished.</w:t>
+      </w:r>
+    </w:p>
+    <w:p>
+      <w:r>
+        <w:rPr>
+          <w:rFonts w:hint="eastAsia"/>
+          <w:highlight w:val="yellow"/>
+        </w:rPr>
+        <w:t xml:space="preserve">Aim: find a better </w:t>
+      </w:r>
+      <w:proofErr w:type="spellStart"/>
+      <w:r>
+        <w:rPr>
+          <w:rFonts w:hint="eastAsia"/>
+          <w:highlight w:val="yellow"/>
+        </w:rPr>
+        <w:t>tts</w:t>
+      </w:r>
+      <w:proofErr w:type="spellEnd"/>
+      <w:r>
+        <w:rPr>
+          <w:rFonts w:hint="eastAsia"/>
+          <w:highlight w:val="yellow"/>
+        </w:rPr>
+        <w:t xml:space="preserve"> </w:t>
+      </w:r>
+      <w:proofErr w:type="spellStart"/>
+      <w:proofErr w:type="gramStart"/>
+      <w:r>
+        <w:rPr>
+          <w:rFonts w:hint="eastAsia"/>
+          <w:highlight w:val="yellow"/>
+        </w:rPr>
+        <w:t>tool,maybe</w:t>
+      </w:r>
+      <w:proofErr w:type="spellEnd"/>
+      <w:proofErr w:type="gramEnd"/>
+      <w:r>
+        <w:rPr>
+          <w:rFonts w:hint="eastAsia"/>
+          <w:highlight w:val="yellow"/>
+        </w:rPr>
+        <w:t xml:space="preserve"> help?</w:t>
+      </w:r>
+      <w:r>
+        <w:rPr>
+          <w:rFonts w:hint="eastAsia"/>
+        </w:rPr>
+        <w:t xml:space="preserve"> </w:t>
+      </w:r>
+    </w:p>
+    <w:p>
       <w:r>
         <w:lastRenderedPageBreak/>
         <w:t>P</w:t>
@@ -111,8 +167,168 @@
         <w:rPr>
           <w:rFonts w:hint="eastAsia"/>
         </w:rPr>
-        <w:t>roblems: Not include the emotions yet.</w:t>
-      </w:r>
+        <w:t xml:space="preserve">roblems: Not </w:t>
+      </w:r>
+      <w:r>
+        <w:t>including</w:t>
+      </w:r>
+      <w:r>
+        <w:rPr>
+          <w:rFonts w:hint="eastAsia"/>
+        </w:rPr>
+        <w:t xml:space="preserve"> the emotions yet.</w:t>
+      </w:r>
+    </w:p>
+    <w:p>
+      <w:r>
+        <w:rPr>
+          <w:rFonts w:hint="eastAsia"/>
+          <w:highlight w:val="yellow"/>
+        </w:rPr>
+        <w:t xml:space="preserve">Aim: Chatbot can </w:t>
+      </w:r>
+      <w:r>
+        <w:rPr>
+          <w:highlight w:val="yellow"/>
+        </w:rPr>
+        <w:t>respond</w:t>
+      </w:r>
+      <w:r>
+        <w:rPr>
+          <w:rFonts w:hint="eastAsia"/>
+          <w:highlight w:val="yellow"/>
+        </w:rPr>
+        <w:t xml:space="preserve"> based on the emotions</w:t>
+      </w:r>
+    </w:p>
+    <w:p>
+      <w:pPr>
+        <w:rPr>
+          <w:rFonts w:hint="eastAsia"/>
+        </w:rPr>
+      </w:pPr>
+      <w:r>
+        <w:t>5/15/2025</w:t>
+      </w:r>
+    </w:p>
+    <w:p>
+      <w:r>
+        <w:rPr>
+          <w:rFonts w:hint="eastAsia"/>
+        </w:rPr>
+        <w:t xml:space="preserve">Problems: </w:t>
+      </w:r>
+      <w:r>
+        <w:t>Conversations</w:t>
+      </w:r>
+      <w:r>
+        <w:rPr>
+          <w:rFonts w:hint="eastAsia"/>
+        </w:rPr>
+        <w:t xml:space="preserve"> </w:t>
+      </w:r>
+      <w:r>
+        <w:t xml:space="preserve">are </w:t>
+      </w:r>
+      <w:r>
+        <w:rPr>
+          <w:rFonts w:hint="eastAsia"/>
+        </w:rPr>
+        <w:t>not making sense</w:t>
+      </w:r>
+    </w:p>
+    <w:p>
+      <w:r>
+        <w:t>Solution</w:t>
+      </w:r>
+      <w:r>
+        <w:rPr>
+          <w:rFonts w:hint="eastAsia"/>
+        </w:rPr>
+        <w:t xml:space="preserve">: Add </w:t>
+      </w:r>
+      <w:r>
+        <w:t xml:space="preserve">a </w:t>
+      </w:r>
+      <w:r>
+        <w:rPr>
+          <w:rFonts w:hint="eastAsia"/>
+        </w:rPr>
+        <w:t xml:space="preserve">memory model to the </w:t>
+      </w:r>
+      <w:r>
+        <w:t>chatbot</w:t>
+      </w:r>
+    </w:p>
+    <w:p/>
+    <w:p>
+      <w:r>
+        <w:rPr>
+          <w:rFonts w:hint="eastAsia"/>
+        </w:rPr>
+        <w:t>Problems: With memory models there will be too much tokens</w:t>
+      </w:r>
+    </w:p>
+    <w:p>
+      <w:r>
+        <w:rPr>
+          <w:rFonts w:hint="eastAsia"/>
+        </w:rPr>
+        <w:t xml:space="preserve">Solution: </w:t>
+      </w:r>
+      <w:r>
+        <w:t>Clear history or reset regularly</w:t>
+      </w:r>
+      <w:r>
+        <w:rPr>
+          <w:rFonts w:hint="eastAsia"/>
+        </w:rPr>
+        <w:t xml:space="preserve"> when almost reach the </w:t>
+      </w:r>
+      <w:r>
+        <w:t>maximum</w:t>
+      </w:r>
+      <w:r>
+        <w:rPr>
+          <w:rFonts w:hint="eastAsia"/>
+        </w:rPr>
+        <w:t>.</w:t>
+      </w:r>
+    </w:p>
+    <w:p/>
+    <w:p>
+      <w:pPr>
+        <w:rPr>
+          <w:rFonts w:hint="eastAsia"/>
+        </w:rPr>
+      </w:pPr>
+      <w:r>
+        <w:rPr>
+          <w:rFonts w:hint="eastAsia"/>
+        </w:rPr>
+        <w:t xml:space="preserve">Problems: </w:t>
+      </w:r>
+      <w:proofErr w:type="spellStart"/>
+      <w:r>
+        <w:rPr>
+          <w:rFonts w:hint="eastAsia"/>
+        </w:rPr>
+        <w:t>chatgpt</w:t>
+      </w:r>
+      <w:proofErr w:type="spellEnd"/>
+      <w:r>
+        <w:rPr>
+          <w:rFonts w:hint="eastAsia"/>
+        </w:rPr>
+        <w:t xml:space="preserve"> 说了很长一段话之后卡住了，没有继续进行下一轮</w:t>
+      </w:r>
+    </w:p>
+    <w:p>
+      <w:pPr>
+        <w:rPr>
+          <w:rFonts w:hint="eastAsia"/>
+        </w:rPr>
+      </w:pPr>
     </w:p>
     <w:sectPr>
       <w:pgSz w:w="11906" w:h="16838"/>
@@ -781,7 +997,6 @@
   <w:style w:type="character" w:default="1" w:styleId="a0">
     <w:name w:val="Default Paragraph Font"/>
     <w:uiPriority w:val="1"/>
-    <w:semiHidden/>
     <w:unhideWhenUsed/>
   </w:style>
   <w:style w:type="table" w:default="1" w:styleId="a1">

</xml_diff>